<commit_message>
refactor: remove legacy MSG-3D implementation and add project structure with new inference pipeline and documentation
</commit_message>
<xml_diff>
--- a/reports/project report.docx
+++ b/reports/project report.docx
@@ -275,6 +275,19 @@
           <w14:ligatures w14:val="standardContextual"/>
         </w:rPr>
         <w:t>P1N</w:t>
+      </w:r>
+      <w:r>
+        <w:rPr>
+          <w:rFonts w:ascii="Times New Roman" w:eastAsiaTheme="minorHAnsi" w:hAnsi="Times New Roman" w:cs="Times New Roman"/>
+          <w:b/>
+          <w:bCs/>
+          <w:color w:val="000000"/>
+          <w:kern w:val="2"/>
+          <w:sz w:val="28"/>
+          <w:szCs w:val="28"/>
+          <w14:ligatures w14:val="standardContextual"/>
+        </w:rPr>
+        <w:t xml:space="preserve"> (3P14)</w:t>
       </w:r>
     </w:p>
     <w:p>
@@ -442,7 +455,7 @@
           <w:lang w:val="en-IN"/>
           <w14:ligatures w14:val="standardContextual"/>
         </w:rPr>
-        <w:t>u</w:t>
+        <w:t>a</w:t>
       </w:r>
     </w:p>
     <w:p>
@@ -482,10 +495,31 @@
     </w:p>
     <w:p>
       <w:pPr>
-        <w:rPr>
-          <w:lang w:val="en-IN"/>
-        </w:rPr>
-      </w:pPr>
+        <w:jc w:val="center"/>
+        <w:rPr>
+          <w:rFonts w:ascii="Times New Roman" w:eastAsiaTheme="minorHAnsi" w:hAnsi="Times New Roman" w:cs="Times New Roman"/>
+          <w:b/>
+          <w:bCs/>
+          <w:color w:val="000000"/>
+          <w:kern w:val="2"/>
+          <w:sz w:val="28"/>
+          <w:szCs w:val="28"/>
+          <w14:ligatures w14:val="standardContextual"/>
+        </w:rPr>
+      </w:pPr>
+      <w:r>
+        <w:rPr>
+          <w:rFonts w:ascii="Times New Roman" w:eastAsiaTheme="minorHAnsi" w:hAnsi="Times New Roman" w:cs="Times New Roman"/>
+          <w:b/>
+          <w:bCs/>
+          <w:color w:val="000000"/>
+          <w:kern w:val="2"/>
+          <w:sz w:val="28"/>
+          <w:szCs w:val="28"/>
+          <w14:ligatures w14:val="standardContextual"/>
+        </w:rPr>
+        <w:t>May 2026</w:t>
+      </w:r>
     </w:p>
     <w:p>
       <w:pPr>

</xml_diff>